<commit_message>
Finished initial test plan, and exported pdf
</commit_message>
<xml_diff>
--- a/userTesting/Energy Map.docx
+++ b/userTesting/Energy Map.docx
@@ -634,15 +634,7 @@
           <w:sz w:val="24"/>
           <w:szCs w:val="24"/>
         </w:rPr>
-        <w:t>additional attempts are made, an alert slides in from the side (might move too quickly, needs to be tested).</w:t>
-      </w:r>
-      <w:r>
-        <w:rPr>
-          <w:rFonts w:ascii="Lato" w:hAnsi="Lato" w:cs="Lato"/>
-          <w:sz w:val="24"/>
-          <w:szCs w:val="24"/>
-        </w:rPr>
-        <w:t xml:space="preserve"> Can the grey info icon be clicked (hovered if mouse is available) to show what GWh means (sort of). </w:t>
+        <w:t xml:space="preserve">additional attempts are made, an alert slides in from the side (might move too quickly, needs to be tested). Can the grey info icon be clicked (hovered if mouse is available) to show what GWh means (sort of). </w:t>
       </w:r>
       <w:r>
         <w:rPr>
@@ -679,12 +671,14 @@
           <w:numId w:val="1"/>
         </w:numPr>
         <w:rPr>
-          <w:sz w:val="24"/>
-          <w:szCs w:val="24"/>
-        </w:rPr>
-      </w:pPr>
-      <w:r>
-        <w:rPr>
+          <w:rFonts w:ascii="Lato" w:hAnsi="Lato" w:cs="Lato"/>
+          <w:sz w:val="24"/>
+          <w:szCs w:val="24"/>
+        </w:rPr>
+      </w:pPr>
+      <w:r>
+        <w:rPr>
+          <w:rFonts w:ascii="Lato" w:hAnsi="Lato" w:cs="Lato"/>
           <w:sz w:val="24"/>
           <w:szCs w:val="24"/>
         </w:rPr>
@@ -692,6 +686,7 @@
       </w:r>
       <w:r>
         <w:rPr>
+          <w:rFonts w:ascii="Lato" w:hAnsi="Lato" w:cs="Lato"/>
           <w:sz w:val="24"/>
           <w:szCs w:val="24"/>
         </w:rPr>
@@ -722,18 +717,1456 @@
           <w:sz w:val="24"/>
           <w:szCs w:val="24"/>
         </w:rPr>
-        <w:t>How said parts should be tested (user test plan)</w:t>
-      </w:r>
-      <w:r>
+        <w:t>How said parts should be tested (user test plan):</w:t>
+      </w:r>
+    </w:p>
+    <w:p>
+      <w:pPr>
+        <w:rPr>
+          <w:rFonts w:ascii="Lato" w:hAnsi="Lato" w:cs="Lato"/>
+          <w:sz w:val="24"/>
+          <w:szCs w:val="24"/>
+        </w:rPr>
+      </w:pPr>
+      <w:r>
+        <w:rPr>
+          <w:rFonts w:ascii="Lato" w:hAnsi="Lato" w:cs="Lato"/>
+          <w:sz w:val="24"/>
+          <w:szCs w:val="24"/>
+        </w:rPr>
+        <w:t xml:space="preserve">Since the user tests are aimed to be </w:t>
+      </w:r>
+      <w:r>
+        <w:rPr>
+          <w:rFonts w:ascii="Lato" w:hAnsi="Lato" w:cs="Lato"/>
+          <w:sz w:val="24"/>
+          <w:szCs w:val="24"/>
+        </w:rPr>
+        <w:t xml:space="preserve">conducted on the 54-inch touch displays in Visualisation Center C, it would, according to </w:t>
+      </w:r>
+      <w:r>
+        <w:rPr>
+          <w:rFonts w:ascii="Lato" w:hAnsi="Lato" w:cs="Lato"/>
+          <w:sz w:val="24"/>
+          <w:szCs w:val="24"/>
+        </w:rPr>
+        <w:t>Carpendale</w:t>
+      </w:r>
+      <w:r>
+        <w:rPr>
+          <w:rFonts w:ascii="Lato" w:hAnsi="Lato" w:cs="Lato"/>
+          <w:sz w:val="24"/>
+          <w:szCs w:val="24"/>
+        </w:rPr>
+        <w:t xml:space="preserve"> in </w:t>
+      </w:r>
+      <w:r>
+        <w:rPr>
+          <w:rFonts w:ascii="Lato" w:hAnsi="Lato" w:cs="Lato"/>
+          <w:i/>
+          <w:iCs/>
+          <w:sz w:val="24"/>
+          <w:szCs w:val="24"/>
+        </w:rPr>
+        <w:t>Evaluating Information Visualizations</w:t>
+      </w:r>
+      <w:r>
+        <w:rPr>
+          <w:rFonts w:ascii="Lato" w:hAnsi="Lato" w:cs="Lato"/>
+          <w:sz w:val="24"/>
+          <w:szCs w:val="24"/>
+        </w:rPr>
+        <w:t xml:space="preserve">, be suitable to perform the user tests as either </w:t>
+      </w:r>
+      <w:r>
+        <w:rPr>
+          <w:rFonts w:ascii="Lato" w:hAnsi="Lato" w:cs="Lato"/>
+          <w:i/>
+          <w:iCs/>
+          <w:sz w:val="24"/>
+          <w:szCs w:val="24"/>
+        </w:rPr>
+        <w:t>Field Studies</w:t>
+      </w:r>
+      <w:r>
+        <w:rPr>
+          <w:rFonts w:ascii="Lato" w:hAnsi="Lato" w:cs="Lato"/>
+          <w:sz w:val="24"/>
+          <w:szCs w:val="24"/>
+        </w:rPr>
+        <w:t xml:space="preserve"> or </w:t>
+      </w:r>
+      <w:r>
+        <w:rPr>
+          <w:rFonts w:ascii="Lato" w:hAnsi="Lato" w:cs="Lato"/>
+          <w:i/>
+          <w:iCs/>
+          <w:sz w:val="24"/>
+          <w:szCs w:val="24"/>
+        </w:rPr>
+        <w:t>Field Experiments</w:t>
+      </w:r>
+      <w:r>
+        <w:rPr>
+          <w:rFonts w:ascii="Lato" w:hAnsi="Lato" w:cs="Lato"/>
+          <w:sz w:val="24"/>
+          <w:szCs w:val="24"/>
+        </w:rPr>
+        <w:t xml:space="preserve"> (Carpendale, </w:t>
+      </w:r>
+      <w:r>
+        <w:rPr>
+          <w:rFonts w:ascii="Lato" w:hAnsi="Lato" w:cs="Lato"/>
+          <w:sz w:val="24"/>
+          <w:szCs w:val="24"/>
+        </w:rPr>
+        <w:t>2008</w:t>
+      </w:r>
+      <w:r>
+        <w:rPr>
+          <w:rFonts w:ascii="Lato" w:hAnsi="Lato" w:cs="Lato"/>
+          <w:sz w:val="24"/>
+          <w:szCs w:val="24"/>
+        </w:rPr>
+        <w:t xml:space="preserve">). </w:t>
+      </w:r>
+      <w:r>
+        <w:rPr>
+          <w:rFonts w:ascii="Lato" w:hAnsi="Lato" w:cs="Lato"/>
+          <w:sz w:val="24"/>
+          <w:szCs w:val="24"/>
+        </w:rPr>
+        <w:t>Both methodologies aim to</w:t>
+      </w:r>
+      <w:r>
+        <w:rPr>
+          <w:rFonts w:ascii="Lato" w:hAnsi="Lato" w:cs="Lato"/>
+          <w:sz w:val="24"/>
+          <w:szCs w:val="24"/>
+        </w:rPr>
+        <w:t xml:space="preserve"> be generally unobtrusive compared to </w:t>
+      </w:r>
+      <w:r>
+        <w:rPr>
+          <w:rFonts w:ascii="Lato" w:hAnsi="Lato" w:cs="Lato"/>
+          <w:i/>
+          <w:iCs/>
+          <w:sz w:val="24"/>
+          <w:szCs w:val="24"/>
+        </w:rPr>
+        <w:t xml:space="preserve">Laboratory Experiments </w:t>
+      </w:r>
+      <w:r>
+        <w:rPr>
+          <w:rFonts w:ascii="Lato" w:hAnsi="Lato" w:cs="Lato"/>
+          <w:sz w:val="24"/>
+          <w:szCs w:val="24"/>
+        </w:rPr>
+        <w:t xml:space="preserve">or </w:t>
+      </w:r>
+      <w:r>
+        <w:rPr>
+          <w:rFonts w:ascii="Lato" w:hAnsi="Lato" w:cs="Lato"/>
+          <w:i/>
+          <w:iCs/>
+          <w:sz w:val="24"/>
+          <w:szCs w:val="24"/>
+        </w:rPr>
+        <w:t>Sample Surveys</w:t>
+      </w:r>
+      <w:r>
+        <w:rPr>
+          <w:rFonts w:ascii="Lato" w:hAnsi="Lato" w:cs="Lato"/>
+          <w:sz w:val="24"/>
+          <w:szCs w:val="24"/>
+        </w:rPr>
+        <w:t xml:space="preserve"> for example (McGarth, 1995). </w:t>
+      </w:r>
+      <w:r>
+        <w:rPr>
+          <w:rFonts w:ascii="Lato" w:hAnsi="Lato" w:cs="Lato"/>
+          <w:sz w:val="24"/>
+          <w:szCs w:val="24"/>
+        </w:rPr>
+        <w:t xml:space="preserve">However, to ensure that the previously mentioned parts of the tool that should be tested, a </w:t>
+      </w:r>
+      <w:r>
+        <w:rPr>
+          <w:rFonts w:ascii="Lato" w:hAnsi="Lato" w:cs="Lato"/>
+          <w:i/>
+          <w:iCs/>
+          <w:sz w:val="24"/>
+          <w:szCs w:val="24"/>
+        </w:rPr>
+        <w:t>Field Experiment</w:t>
+      </w:r>
+      <w:r>
+        <w:rPr>
+          <w:rFonts w:ascii="Lato" w:hAnsi="Lato" w:cs="Lato"/>
+          <w:sz w:val="24"/>
+          <w:szCs w:val="24"/>
+        </w:rPr>
+        <w:t xml:space="preserve"> is more suitable compared to a </w:t>
+      </w:r>
+      <w:r>
+        <w:rPr>
+          <w:rFonts w:ascii="Lato" w:hAnsi="Lato" w:cs="Lato"/>
+          <w:i/>
+          <w:iCs/>
+          <w:sz w:val="24"/>
+          <w:szCs w:val="24"/>
+        </w:rPr>
+        <w:t>Field Study</w:t>
+      </w:r>
+      <w:r>
+        <w:rPr>
+          <w:rFonts w:ascii="Lato" w:hAnsi="Lato" w:cs="Lato"/>
+          <w:sz w:val="24"/>
+          <w:szCs w:val="24"/>
+        </w:rPr>
+        <w:t xml:space="preserve"> since it allows for the use of user tasks, which will be described in following paragraphs</w:t>
+      </w:r>
+      <w:r>
+        <w:rPr>
+          <w:rFonts w:ascii="Lato" w:hAnsi="Lato" w:cs="Lato"/>
+          <w:sz w:val="24"/>
+          <w:szCs w:val="24"/>
+        </w:rPr>
+        <w:t xml:space="preserve"> (Carpendale, 2008)</w:t>
+      </w:r>
+      <w:r>
+        <w:rPr>
+          <w:rFonts w:ascii="Lato" w:hAnsi="Lato" w:cs="Lato"/>
+          <w:sz w:val="24"/>
+          <w:szCs w:val="24"/>
+        </w:rPr>
+        <w:t>.</w:t>
+      </w:r>
+      <w:r>
+        <w:rPr>
+          <w:rFonts w:ascii="Lato" w:hAnsi="Lato" w:cs="Lato"/>
+          <w:sz w:val="24"/>
+          <w:szCs w:val="24"/>
+        </w:rPr>
+        <w:t xml:space="preserve"> This sacrifice of complete </w:t>
+      </w:r>
+      <w:r>
+        <w:rPr>
+          <w:rFonts w:ascii="Lato" w:hAnsi="Lato" w:cs="Lato"/>
+          <w:sz w:val="24"/>
+          <w:szCs w:val="24"/>
+        </w:rPr>
+        <w:t>unobtrusiveness</w:t>
+      </w:r>
+      <w:r>
+        <w:rPr>
+          <w:rFonts w:ascii="Lato" w:hAnsi="Lato" w:cs="Lato"/>
+          <w:sz w:val="24"/>
+          <w:szCs w:val="24"/>
+        </w:rPr>
+        <w:t xml:space="preserve"> aims to reveal possible faults in intended features within the tool.</w:t>
+      </w:r>
+    </w:p>
+    <w:p>
+      <w:pPr>
         <w:rPr>
           <w:rFonts w:ascii="Lato" w:hAnsi="Lato" w:cs="Lato"/>
           <w:color w:val="215E99" w:themeColor="text2" w:themeTint="BF"/>
           <w:sz w:val="24"/>
           <w:szCs w:val="24"/>
         </w:rPr>
-        <w:t>:</w:t>
-      </w:r>
-    </w:p>
+      </w:pPr>
+      <w:r>
+        <w:rPr>
+          <w:rFonts w:ascii="Lato" w:hAnsi="Lato" w:cs="Lato"/>
+          <w:color w:val="215E99" w:themeColor="text2" w:themeTint="BF"/>
+          <w:sz w:val="24"/>
+          <w:szCs w:val="24"/>
+        </w:rPr>
+        <w:t xml:space="preserve">Tasks: </w:t>
+      </w:r>
+    </w:p>
+    <w:p>
+      <w:pPr>
+        <w:pStyle w:val="Liststycke"/>
+        <w:numPr>
+          <w:ilvl w:val="0"/>
+          <w:numId w:val="2"/>
+        </w:numPr>
+        <w:rPr>
+          <w:rFonts w:ascii="Lato" w:hAnsi="Lato" w:cs="Lato"/>
+          <w:sz w:val="24"/>
+          <w:szCs w:val="24"/>
+        </w:rPr>
+      </w:pPr>
+      <w:r>
+        <w:rPr>
+          <w:rFonts w:ascii="Lato" w:hAnsi="Lato" w:cs="Lato"/>
+          <w:b/>
+          <w:bCs/>
+          <w:sz w:val="24"/>
+          <w:szCs w:val="24"/>
+        </w:rPr>
+        <w:t xml:space="preserve">General use of the tool: </w:t>
+      </w:r>
+      <w:r>
+        <w:rPr>
+          <w:rFonts w:ascii="Lato" w:hAnsi="Lato" w:cs="Lato"/>
+          <w:sz w:val="24"/>
+          <w:szCs w:val="24"/>
+        </w:rPr>
+        <w:t xml:space="preserve">Instruct the </w:t>
+      </w:r>
+      <w:r>
+        <w:rPr>
+          <w:rFonts w:ascii="Lato" w:hAnsi="Lato" w:cs="Lato"/>
+          <w:sz w:val="24"/>
+          <w:szCs w:val="24"/>
+        </w:rPr>
+        <w:t>test participant</w:t>
+      </w:r>
+      <w:r>
+        <w:rPr>
+          <w:rFonts w:ascii="Lato" w:hAnsi="Lato" w:cs="Lato"/>
+          <w:sz w:val="24"/>
+          <w:szCs w:val="24"/>
+        </w:rPr>
+        <w:t xml:space="preserve"> to follow the instructions present in the </w:t>
+      </w:r>
+      <w:r>
+        <w:rPr>
+          <w:rFonts w:ascii="Lato" w:hAnsi="Lato" w:cs="Lato"/>
+          <w:sz w:val="24"/>
+          <w:szCs w:val="24"/>
+        </w:rPr>
+        <w:t>side panel pages. If necessary, tell them that they can click on the icons on the bottom of the page to change the displayed page. If most test participants need this hint, there is a possibility that the visual indicator (highlighted icon for current page) is not enough information to allow for navigation.</w:t>
+      </w:r>
+    </w:p>
+    <w:p>
+      <w:pPr>
+        <w:ind w:left="720"/>
+        <w:rPr>
+          <w:rFonts w:ascii="Lato" w:hAnsi="Lato" w:cs="Lato"/>
+          <w:sz w:val="24"/>
+          <w:szCs w:val="24"/>
+        </w:rPr>
+      </w:pPr>
+      <w:r>
+        <w:rPr>
+          <w:rFonts w:ascii="Lato" w:hAnsi="Lato" w:cs="Lato"/>
+          <w:sz w:val="24"/>
+          <w:szCs w:val="24"/>
+        </w:rPr>
+        <w:t>Given the instructions present in the pages, most features of the tool will be explored during this task</w:t>
+      </w:r>
+      <w:r>
+        <w:rPr>
+          <w:rFonts w:ascii="Lato" w:hAnsi="Lato" w:cs="Lato"/>
+          <w:sz w:val="24"/>
+          <w:szCs w:val="24"/>
+        </w:rPr>
+        <w:t xml:space="preserve">. As mentioned previously, readability will be largely evaluated within the side panel. To ensure that data is collected </w:t>
+      </w:r>
+      <w:r>
+        <w:rPr>
+          <w:rFonts w:ascii="Lato" w:hAnsi="Lato" w:cs="Lato"/>
+          <w:sz w:val="24"/>
+          <w:szCs w:val="24"/>
+        </w:rPr>
+        <w:t>regarding</w:t>
+      </w:r>
+      <w:r>
+        <w:rPr>
+          <w:rFonts w:ascii="Lato" w:hAnsi="Lato" w:cs="Lato"/>
+          <w:sz w:val="24"/>
+          <w:szCs w:val="24"/>
+        </w:rPr>
+        <w:t xml:space="preserve"> this, the moderator </w:t>
+      </w:r>
+      <w:r>
+        <w:rPr>
+          <w:rFonts w:ascii="Lato" w:hAnsi="Lato" w:cs="Lato"/>
+          <w:i/>
+          <w:iCs/>
+          <w:sz w:val="24"/>
+          <w:szCs w:val="24"/>
+        </w:rPr>
+        <w:t>should</w:t>
+      </w:r>
+      <w:r>
+        <w:rPr>
+          <w:rFonts w:ascii="Lato" w:hAnsi="Lato" w:cs="Lato"/>
+          <w:sz w:val="24"/>
+          <w:szCs w:val="24"/>
+        </w:rPr>
+        <w:t xml:space="preserve"> ask the test participants if they can read and understand the text present for each set of instructions.</w:t>
+      </w:r>
+      <w:r>
+        <w:rPr>
+          <w:rFonts w:ascii="Lato" w:hAnsi="Lato" w:cs="Lato"/>
+          <w:sz w:val="24"/>
+          <w:szCs w:val="24"/>
+        </w:rPr>
+        <w:t xml:space="preserve"> Additionally, encourage that the test participants describe their actions and thought processes during the test, ensuring to write it down for qualitative data.</w:t>
+      </w:r>
+    </w:p>
+    <w:p>
+      <w:pPr>
+        <w:pStyle w:val="Liststycke"/>
+        <w:numPr>
+          <w:ilvl w:val="0"/>
+          <w:numId w:val="2"/>
+        </w:numPr>
+        <w:rPr>
+          <w:rFonts w:ascii="Lato" w:hAnsi="Lato" w:cs="Lato"/>
+          <w:sz w:val="24"/>
+          <w:szCs w:val="24"/>
+        </w:rPr>
+      </w:pPr>
+      <w:r>
+        <w:rPr>
+          <w:rFonts w:ascii="Lato" w:hAnsi="Lato" w:cs="Lato"/>
+          <w:b/>
+          <w:bCs/>
+          <w:sz w:val="24"/>
+          <w:szCs w:val="24"/>
+        </w:rPr>
+        <w:t xml:space="preserve">Filtering panel functionality: </w:t>
+      </w:r>
+      <w:r>
+        <w:rPr>
+          <w:rFonts w:ascii="Lato" w:hAnsi="Lato" w:cs="Lato"/>
+          <w:sz w:val="24"/>
+          <w:szCs w:val="24"/>
+        </w:rPr>
+        <w:t xml:space="preserve">Instruct the test participant to use the panel in the </w:t>
+      </w:r>
+      <w:r>
+        <w:rPr>
+          <w:rFonts w:ascii="Lato" w:hAnsi="Lato" w:cs="Lato"/>
+          <w:i/>
+          <w:iCs/>
+          <w:sz w:val="24"/>
+          <w:szCs w:val="24"/>
+        </w:rPr>
+        <w:t>bottom-left</w:t>
+      </w:r>
+      <w:r>
+        <w:rPr>
+          <w:rFonts w:ascii="Lato" w:hAnsi="Lato" w:cs="Lato"/>
+          <w:sz w:val="24"/>
+          <w:szCs w:val="24"/>
+        </w:rPr>
+        <w:t xml:space="preserve"> side of the tool to filter for all </w:t>
+      </w:r>
+      <w:r>
+        <w:rPr>
+          <w:rFonts w:ascii="Lato" w:hAnsi="Lato" w:cs="Lato"/>
+          <w:b/>
+          <w:bCs/>
+          <w:sz w:val="24"/>
+          <w:szCs w:val="24"/>
+        </w:rPr>
+        <w:t>Coal</w:t>
+      </w:r>
+      <w:r>
+        <w:rPr>
+          <w:rFonts w:ascii="Lato" w:hAnsi="Lato" w:cs="Lato"/>
+          <w:sz w:val="24"/>
+          <w:szCs w:val="24"/>
+        </w:rPr>
+        <w:t>,</w:t>
+      </w:r>
+      <w:r>
+        <w:rPr>
+          <w:rFonts w:ascii="Lato" w:hAnsi="Lato" w:cs="Lato"/>
+          <w:b/>
+          <w:bCs/>
+          <w:sz w:val="24"/>
+          <w:szCs w:val="24"/>
+        </w:rPr>
+        <w:t xml:space="preserve"> Gas</w:t>
+      </w:r>
+      <w:r>
+        <w:rPr>
+          <w:rFonts w:ascii="Lato" w:hAnsi="Lato" w:cs="Lato"/>
+          <w:sz w:val="24"/>
+          <w:szCs w:val="24"/>
+        </w:rPr>
+        <w:t>,</w:t>
+      </w:r>
+      <w:r>
+        <w:rPr>
+          <w:rFonts w:ascii="Lato" w:hAnsi="Lato" w:cs="Lato"/>
+          <w:b/>
+          <w:bCs/>
+          <w:sz w:val="24"/>
+          <w:szCs w:val="24"/>
+        </w:rPr>
+        <w:t xml:space="preserve"> </w:t>
+      </w:r>
+      <w:r>
+        <w:rPr>
+          <w:rFonts w:ascii="Lato" w:hAnsi="Lato" w:cs="Lato"/>
+          <w:sz w:val="24"/>
+          <w:szCs w:val="24"/>
+        </w:rPr>
+        <w:t xml:space="preserve">and </w:t>
+      </w:r>
+      <w:r>
+        <w:rPr>
+          <w:rFonts w:ascii="Lato" w:hAnsi="Lato" w:cs="Lato"/>
+          <w:b/>
+          <w:bCs/>
+          <w:sz w:val="24"/>
+          <w:szCs w:val="24"/>
+        </w:rPr>
+        <w:t>Oil</w:t>
+      </w:r>
+      <w:r>
+        <w:rPr>
+          <w:rFonts w:ascii="Lato" w:hAnsi="Lato" w:cs="Lato"/>
+          <w:sz w:val="24"/>
+          <w:szCs w:val="24"/>
+        </w:rPr>
+        <w:t xml:space="preserve"> power plants in the world and ask them how many power plants are selected. Correct answer: </w:t>
+      </w:r>
+      <w:r>
+        <w:rPr>
+          <w:rFonts w:ascii="Lato" w:hAnsi="Lato" w:cs="Lato"/>
+          <w:b/>
+          <w:bCs/>
+          <w:sz w:val="24"/>
+          <w:szCs w:val="24"/>
+        </w:rPr>
+        <w:lastRenderedPageBreak/>
+        <w:t>8648</w:t>
+      </w:r>
+      <w:r>
+        <w:rPr>
+          <w:rFonts w:ascii="Lato" w:hAnsi="Lato" w:cs="Lato"/>
+          <w:sz w:val="24"/>
+          <w:szCs w:val="24"/>
+        </w:rPr>
+        <w:t>.</w:t>
+      </w:r>
+      <w:r>
+        <w:rPr>
+          <w:rFonts w:ascii="Lato" w:hAnsi="Lato" w:cs="Lato"/>
+          <w:sz w:val="24"/>
+          <w:szCs w:val="24"/>
+        </w:rPr>
+        <w:t xml:space="preserve"> Next, ask them to only use the buttons in the panel, along with panning of the map, to zoom into </w:t>
+      </w:r>
+      <w:r>
+        <w:rPr>
+          <w:rFonts w:ascii="Lato" w:hAnsi="Lato" w:cs="Lato"/>
+          <w:b/>
+          <w:bCs/>
+          <w:sz w:val="24"/>
+          <w:szCs w:val="24"/>
+        </w:rPr>
+        <w:t>Belgium</w:t>
+      </w:r>
+      <w:r>
+        <w:rPr>
+          <w:rFonts w:ascii="Lato" w:hAnsi="Lato" w:cs="Lato"/>
+          <w:sz w:val="24"/>
+          <w:szCs w:val="24"/>
+        </w:rPr>
+        <w:t xml:space="preserve"> (country does not really matter, but Belgium has many gas power plants). Lastly, ask them to remove all filters and show the entire map, remind them that they can choose any desired method to achieve this. Note down if they used the full screen button and ask </w:t>
+      </w:r>
+      <w:r>
+        <w:rPr>
+          <w:rFonts w:ascii="Lato" w:hAnsi="Lato" w:cs="Lato"/>
+          <w:i/>
+          <w:iCs/>
+          <w:sz w:val="24"/>
+          <w:szCs w:val="24"/>
+        </w:rPr>
+        <w:t>why</w:t>
+      </w:r>
+      <w:r>
+        <w:rPr>
+          <w:rFonts w:ascii="Lato" w:hAnsi="Lato" w:cs="Lato"/>
+          <w:sz w:val="24"/>
+          <w:szCs w:val="24"/>
+        </w:rPr>
+        <w:t xml:space="preserve"> they chose the specific method they used.</w:t>
+      </w:r>
+    </w:p>
+    <w:p>
+      <w:pPr>
+        <w:pStyle w:val="Liststycke"/>
+        <w:rPr>
+          <w:rFonts w:ascii="Lato" w:hAnsi="Lato" w:cs="Lato"/>
+          <w:b/>
+          <w:bCs/>
+          <w:sz w:val="24"/>
+          <w:szCs w:val="24"/>
+        </w:rPr>
+      </w:pPr>
+    </w:p>
+    <w:p>
+      <w:pPr>
+        <w:pStyle w:val="Liststycke"/>
+        <w:numPr>
+          <w:ilvl w:val="0"/>
+          <w:numId w:val="2"/>
+        </w:numPr>
+        <w:rPr>
+          <w:rFonts w:ascii="Lato" w:hAnsi="Lato" w:cs="Lato"/>
+          <w:sz w:val="24"/>
+          <w:szCs w:val="24"/>
+        </w:rPr>
+      </w:pPr>
+      <w:r>
+        <w:rPr>
+          <w:rFonts w:ascii="Lato" w:hAnsi="Lato" w:cs="Lato"/>
+          <w:b/>
+          <w:bCs/>
+          <w:sz w:val="24"/>
+          <w:szCs w:val="24"/>
+        </w:rPr>
+        <w:t xml:space="preserve">Data cards: </w:t>
+      </w:r>
+      <w:r>
+        <w:rPr>
+          <w:rFonts w:ascii="Lato" w:hAnsi="Lato" w:cs="Lato"/>
+          <w:sz w:val="24"/>
+          <w:szCs w:val="24"/>
+        </w:rPr>
+        <w:t xml:space="preserve">Instruct the test participants to use the drop-down filters to select all </w:t>
+      </w:r>
+      <w:r>
+        <w:rPr>
+          <w:rFonts w:ascii="Lato" w:hAnsi="Lato" w:cs="Lato"/>
+          <w:b/>
+          <w:bCs/>
+          <w:sz w:val="24"/>
+          <w:szCs w:val="24"/>
+        </w:rPr>
+        <w:t>Hydro</w:t>
+      </w:r>
+      <w:r>
+        <w:rPr>
+          <w:rFonts w:ascii="Lato" w:hAnsi="Lato" w:cs="Lato"/>
+          <w:sz w:val="24"/>
+          <w:szCs w:val="24"/>
+        </w:rPr>
+        <w:t xml:space="preserve"> power plants in </w:t>
+      </w:r>
+      <w:r>
+        <w:rPr>
+          <w:rFonts w:ascii="Lato" w:hAnsi="Lato" w:cs="Lato"/>
+          <w:b/>
+          <w:bCs/>
+          <w:sz w:val="24"/>
+          <w:szCs w:val="24"/>
+        </w:rPr>
+        <w:t>Sweden</w:t>
+      </w:r>
+      <w:r>
+        <w:rPr>
+          <w:rFonts w:ascii="Lato" w:hAnsi="Lato" w:cs="Lato"/>
+          <w:sz w:val="24"/>
+          <w:szCs w:val="24"/>
+        </w:rPr>
+        <w:t xml:space="preserve"> and task them to find “</w:t>
+      </w:r>
+      <w:r>
+        <w:rPr>
+          <w:rFonts w:ascii="Lato" w:hAnsi="Lato" w:cs="Lato"/>
+          <w:b/>
+          <w:bCs/>
+          <w:sz w:val="24"/>
+          <w:szCs w:val="24"/>
+        </w:rPr>
+        <w:t xml:space="preserve">Lango </w:t>
+      </w:r>
+      <w:r>
+        <w:rPr>
+          <w:rFonts w:ascii="Lato" w:hAnsi="Lato" w:cs="Lato"/>
+          <w:sz w:val="24"/>
+          <w:szCs w:val="24"/>
+        </w:rPr>
+        <w:t>off the coast of Östergötland”. Firstly, this will evaluate if the colour choices are suitable for the current map used since Långö is represented by a rather small green circle. Important that it is logged if the test participant can find the power plant without additional assistance. Whether or not the test participant can find the power plant (if not show where it is), ask them to recite the information they can read about the power plant, which goes as follows:</w:t>
+      </w:r>
+    </w:p>
+    <w:p>
+      <w:pPr>
+        <w:pStyle w:val="Liststycke"/>
+        <w:rPr>
+          <w:rFonts w:ascii="Lato" w:hAnsi="Lato" w:cs="Lato"/>
+          <w:sz w:val="24"/>
+          <w:szCs w:val="24"/>
+        </w:rPr>
+      </w:pPr>
+    </w:p>
+    <w:p>
+      <w:pPr>
+        <w:pStyle w:val="Liststycke"/>
+        <w:numPr>
+          <w:ilvl w:val="1"/>
+          <w:numId w:val="2"/>
+        </w:numPr>
+        <w:rPr>
+          <w:rFonts w:ascii="Lato" w:hAnsi="Lato" w:cs="Lato"/>
+          <w:sz w:val="24"/>
+          <w:szCs w:val="24"/>
+        </w:rPr>
+      </w:pPr>
+      <w:r>
+        <w:rPr>
+          <w:rFonts w:ascii="Lato" w:hAnsi="Lato" w:cs="Lato"/>
+          <w:b/>
+          <w:bCs/>
+          <w:sz w:val="24"/>
+          <w:szCs w:val="24"/>
+        </w:rPr>
+        <w:t xml:space="preserve">Commissioning Year: </w:t>
+      </w:r>
+      <w:r>
+        <w:rPr>
+          <w:rFonts w:ascii="Lato" w:hAnsi="Lato" w:cs="Lato"/>
+          <w:sz w:val="24"/>
+          <w:szCs w:val="24"/>
+        </w:rPr>
+        <w:t>1956</w:t>
+      </w:r>
+    </w:p>
+    <w:p>
+      <w:pPr>
+        <w:pStyle w:val="Liststycke"/>
+        <w:numPr>
+          <w:ilvl w:val="1"/>
+          <w:numId w:val="2"/>
+        </w:numPr>
+        <w:rPr>
+          <w:rFonts w:ascii="Lato" w:hAnsi="Lato" w:cs="Lato"/>
+          <w:sz w:val="24"/>
+          <w:szCs w:val="24"/>
+        </w:rPr>
+      </w:pPr>
+      <w:r>
+        <w:rPr>
+          <w:rFonts w:ascii="Lato" w:hAnsi="Lato" w:cs="Lato"/>
+          <w:b/>
+          <w:bCs/>
+          <w:sz w:val="24"/>
+          <w:szCs w:val="24"/>
+        </w:rPr>
+        <w:t>Primary Fuel:</w:t>
+      </w:r>
+      <w:r>
+        <w:rPr>
+          <w:rFonts w:ascii="Lato" w:hAnsi="Lato" w:cs="Lato"/>
+          <w:sz w:val="24"/>
+          <w:szCs w:val="24"/>
+        </w:rPr>
+        <w:t xml:space="preserve"> Hydro</w:t>
+      </w:r>
+    </w:p>
+    <w:p>
+      <w:pPr>
+        <w:pStyle w:val="Liststycke"/>
+        <w:numPr>
+          <w:ilvl w:val="1"/>
+          <w:numId w:val="2"/>
+        </w:numPr>
+        <w:rPr>
+          <w:rFonts w:ascii="Lato" w:hAnsi="Lato" w:cs="Lato"/>
+          <w:sz w:val="24"/>
+          <w:szCs w:val="24"/>
+        </w:rPr>
+      </w:pPr>
+      <w:r>
+        <w:rPr>
+          <w:rFonts w:ascii="Lato" w:hAnsi="Lato" w:cs="Lato"/>
+          <w:b/>
+          <w:bCs/>
+          <w:sz w:val="24"/>
+          <w:szCs w:val="24"/>
+        </w:rPr>
+        <w:t xml:space="preserve">Capacity: </w:t>
+      </w:r>
+      <w:r>
+        <w:rPr>
+          <w:rFonts w:ascii="Lato" w:hAnsi="Lato" w:cs="Lato"/>
+          <w:sz w:val="24"/>
+          <w:szCs w:val="24"/>
+        </w:rPr>
+        <w:t>1MW</w:t>
+      </w:r>
+    </w:p>
+    <w:p>
+      <w:pPr>
+        <w:pStyle w:val="Liststycke"/>
+        <w:numPr>
+          <w:ilvl w:val="1"/>
+          <w:numId w:val="2"/>
+        </w:numPr>
+        <w:rPr>
+          <w:rFonts w:ascii="Lato" w:hAnsi="Lato" w:cs="Lato"/>
+          <w:sz w:val="24"/>
+          <w:szCs w:val="24"/>
+        </w:rPr>
+      </w:pPr>
+      <w:r>
+        <w:rPr>
+          <w:rFonts w:ascii="Lato" w:hAnsi="Lato" w:cs="Lato"/>
+          <w:b/>
+          <w:bCs/>
+          <w:sz w:val="24"/>
+          <w:szCs w:val="24"/>
+        </w:rPr>
+        <w:t>Generation:</w:t>
+      </w:r>
+      <w:r>
+        <w:rPr>
+          <w:rFonts w:ascii="Lato" w:hAnsi="Lato" w:cs="Lato"/>
+          <w:sz w:val="24"/>
+          <w:szCs w:val="24"/>
+        </w:rPr>
+        <w:t xml:space="preserve"> 4.13 GWh</w:t>
+      </w:r>
+    </w:p>
+    <w:p>
+      <w:pPr>
+        <w:ind w:left="720"/>
+        <w:rPr>
+          <w:rFonts w:ascii="Lato" w:hAnsi="Lato" w:cs="Lato"/>
+          <w:sz w:val="24"/>
+          <w:szCs w:val="24"/>
+        </w:rPr>
+      </w:pPr>
+      <w:r>
+        <w:rPr>
+          <w:rFonts w:ascii="Lato" w:hAnsi="Lato" w:cs="Lato"/>
+          <w:sz w:val="24"/>
+          <w:szCs w:val="24"/>
+        </w:rPr>
+        <w:t xml:space="preserve">Note down whether the answers are correct or not, next, if they have not done it on their own yet, ask the participant to recite information about power generation in the entirety of Sweden, specifically, </w:t>
+      </w:r>
+      <w:r>
+        <w:rPr>
+          <w:rFonts w:ascii="Lato" w:hAnsi="Lato" w:cs="Lato"/>
+          <w:b/>
+          <w:bCs/>
+          <w:sz w:val="24"/>
+          <w:szCs w:val="24"/>
+        </w:rPr>
+        <w:t>which three primary fuels contribute to most of the generation in Sweden.</w:t>
+      </w:r>
+      <w:r>
+        <w:rPr>
+          <w:rFonts w:ascii="Lato" w:hAnsi="Lato" w:cs="Lato"/>
+          <w:sz w:val="24"/>
+          <w:szCs w:val="24"/>
+        </w:rPr>
+        <w:t xml:space="preserve"> Log if the test participants are correct or wrong in their answer. Additionally, keep notes on what the test participants says during this task, especially if it is relevant to the structure of or information in the data cards.</w:t>
+      </w:r>
+    </w:p>
+    <w:p>
+      <w:pPr>
+        <w:pStyle w:val="Liststycke"/>
+        <w:numPr>
+          <w:ilvl w:val="0"/>
+          <w:numId w:val="2"/>
+        </w:numPr>
+        <w:rPr>
+          <w:rFonts w:ascii="Lato" w:hAnsi="Lato" w:cs="Lato"/>
+          <w:sz w:val="24"/>
+          <w:szCs w:val="24"/>
+        </w:rPr>
+      </w:pPr>
+      <w:r>
+        <w:rPr>
+          <w:rFonts w:ascii="Lato" w:hAnsi="Lato" w:cs="Lato"/>
+          <w:b/>
+          <w:bCs/>
+          <w:sz w:val="24"/>
+          <w:szCs w:val="24"/>
+        </w:rPr>
+        <w:t xml:space="preserve">Filtering by drop down menus: </w:t>
+      </w:r>
+      <w:r>
+        <w:rPr>
+          <w:rFonts w:ascii="Lato" w:hAnsi="Lato" w:cs="Lato"/>
+          <w:sz w:val="24"/>
+          <w:szCs w:val="24"/>
+        </w:rPr>
+        <w:t xml:space="preserve">With </w:t>
+      </w:r>
+      <w:r>
+        <w:rPr>
+          <w:rFonts w:ascii="Lato" w:hAnsi="Lato" w:cs="Lato"/>
+          <w:b/>
+          <w:bCs/>
+          <w:sz w:val="24"/>
+          <w:szCs w:val="24"/>
+        </w:rPr>
+        <w:t>Sweden</w:t>
+      </w:r>
+      <w:r>
+        <w:rPr>
+          <w:rFonts w:ascii="Lato" w:hAnsi="Lato" w:cs="Lato"/>
+          <w:sz w:val="24"/>
+          <w:szCs w:val="24"/>
+        </w:rPr>
+        <w:t xml:space="preserve"> and </w:t>
+      </w:r>
+      <w:r>
+        <w:rPr>
+          <w:rFonts w:ascii="Lato" w:hAnsi="Lato" w:cs="Lato"/>
+          <w:b/>
+          <w:bCs/>
+          <w:sz w:val="24"/>
+          <w:szCs w:val="24"/>
+        </w:rPr>
+        <w:t>Hydro</w:t>
+      </w:r>
+      <w:r>
+        <w:rPr>
+          <w:rFonts w:ascii="Lato" w:hAnsi="Lato" w:cs="Lato"/>
+          <w:sz w:val="24"/>
+          <w:szCs w:val="24"/>
+        </w:rPr>
+        <w:t xml:space="preserve"> still selected in the filter, instruct the test participants to add </w:t>
+      </w:r>
+      <w:r>
+        <w:rPr>
+          <w:rFonts w:ascii="Lato" w:hAnsi="Lato" w:cs="Lato"/>
+          <w:b/>
+          <w:bCs/>
+          <w:sz w:val="24"/>
+          <w:szCs w:val="24"/>
+        </w:rPr>
+        <w:t xml:space="preserve">Norway </w:t>
+      </w:r>
+      <w:r>
+        <w:rPr>
+          <w:rFonts w:ascii="Lato" w:hAnsi="Lato" w:cs="Lato"/>
+          <w:sz w:val="24"/>
+          <w:szCs w:val="24"/>
+        </w:rPr>
+        <w:t xml:space="preserve">and </w:t>
+      </w:r>
+      <w:r>
+        <w:rPr>
+          <w:rFonts w:ascii="Lato" w:hAnsi="Lato" w:cs="Lato"/>
+          <w:b/>
+          <w:bCs/>
+          <w:sz w:val="24"/>
+          <w:szCs w:val="24"/>
+        </w:rPr>
+        <w:t>Finland</w:t>
+      </w:r>
+      <w:r>
+        <w:rPr>
+          <w:rFonts w:ascii="Lato" w:hAnsi="Lato" w:cs="Lato"/>
+          <w:sz w:val="24"/>
+          <w:szCs w:val="24"/>
+        </w:rPr>
+        <w:t xml:space="preserve">, along with the fuel types </w:t>
+      </w:r>
+      <w:r>
+        <w:rPr>
+          <w:rFonts w:ascii="Lato" w:hAnsi="Lato" w:cs="Lato"/>
+          <w:b/>
+          <w:bCs/>
+          <w:sz w:val="24"/>
+          <w:szCs w:val="24"/>
+        </w:rPr>
+        <w:t>Nuclear</w:t>
+      </w:r>
+      <w:r>
+        <w:rPr>
+          <w:rFonts w:ascii="Lato" w:hAnsi="Lato" w:cs="Lato"/>
+          <w:sz w:val="24"/>
+          <w:szCs w:val="24"/>
+        </w:rPr>
+        <w:t xml:space="preserve"> and </w:t>
+      </w:r>
+      <w:r>
+        <w:rPr>
+          <w:rFonts w:ascii="Lato" w:hAnsi="Lato" w:cs="Lato"/>
+          <w:b/>
+          <w:bCs/>
+          <w:sz w:val="24"/>
+          <w:szCs w:val="24"/>
+        </w:rPr>
+        <w:t>Wind</w:t>
+      </w:r>
+      <w:r>
+        <w:rPr>
+          <w:rFonts w:ascii="Lato" w:hAnsi="Lato" w:cs="Lato"/>
+          <w:sz w:val="24"/>
+          <w:szCs w:val="24"/>
+        </w:rPr>
+        <w:t xml:space="preserve">. If they previously have not commented on how satisfactory this process feels, ask them now. </w:t>
+      </w:r>
+      <w:r>
+        <w:rPr>
+          <w:rFonts w:ascii="Lato" w:hAnsi="Lato" w:cs="Lato"/>
+          <w:sz w:val="24"/>
+          <w:szCs w:val="24"/>
+        </w:rPr>
+        <w:t xml:space="preserve">If they have any problem with how the drop down menus are structured, it should be noted down. Next, task them to fit all shown power plants into view. Ask which primary fuel is most common among the shown points </w:t>
+      </w:r>
+      <w:r>
+        <w:rPr>
+          <w:rFonts w:ascii="Lato" w:hAnsi="Lato" w:cs="Lato"/>
+        </w:rPr>
+        <w:t xml:space="preserve">(correct: </w:t>
+      </w:r>
+      <w:r>
+        <w:rPr>
+          <w:rFonts w:ascii="Lato" w:hAnsi="Lato" w:cs="Lato"/>
+          <w:b/>
+          <w:bCs/>
+        </w:rPr>
+        <w:t>Hydro</w:t>
+      </w:r>
+      <w:r>
+        <w:rPr>
+          <w:rFonts w:ascii="Lato" w:hAnsi="Lato" w:cs="Lato"/>
+        </w:rPr>
+        <w:t xml:space="preserve">) and what region contains the largest concentration of this fuel type (correct: </w:t>
+      </w:r>
+      <w:r>
+        <w:rPr>
+          <w:rFonts w:ascii="Lato" w:hAnsi="Lato" w:cs="Lato"/>
+          <w:b/>
+          <w:bCs/>
+        </w:rPr>
+        <w:t>Norway</w:t>
+      </w:r>
+      <w:r>
+        <w:rPr>
+          <w:rFonts w:ascii="Lato" w:hAnsi="Lato" w:cs="Lato"/>
+        </w:rPr>
+        <w:t xml:space="preserve">). Lastly, ask them which fuel types contributes the most to the actual generation in these areas (correct: </w:t>
+      </w:r>
+      <w:r>
+        <w:rPr>
+          <w:rFonts w:ascii="Lato" w:hAnsi="Lato" w:cs="Lato"/>
+          <w:b/>
+          <w:bCs/>
+        </w:rPr>
+        <w:t>Hydro—Norway</w:t>
+      </w:r>
+      <w:r>
+        <w:rPr>
+          <w:rFonts w:ascii="Lato" w:hAnsi="Lato" w:cs="Lato"/>
+        </w:rPr>
+        <w:t xml:space="preserve">, </w:t>
+      </w:r>
+      <w:r>
+        <w:rPr>
+          <w:rFonts w:ascii="Lato" w:hAnsi="Lato" w:cs="Lato"/>
+          <w:b/>
+          <w:bCs/>
+        </w:rPr>
+        <w:t>Nuclear—Sweden</w:t>
+      </w:r>
+      <w:r>
+        <w:rPr>
+          <w:rFonts w:ascii="Lato" w:hAnsi="Lato" w:cs="Lato"/>
+        </w:rPr>
+        <w:t xml:space="preserve">, </w:t>
+      </w:r>
+      <w:r>
+        <w:rPr>
+          <w:rFonts w:ascii="Lato" w:hAnsi="Lato" w:cs="Lato"/>
+          <w:b/>
+          <w:bCs/>
+        </w:rPr>
+        <w:t>Nuclear—Finland</w:t>
+      </w:r>
+      <w:r>
+        <w:rPr>
+          <w:rFonts w:ascii="Lato" w:hAnsi="Lato" w:cs="Lato"/>
+        </w:rPr>
+        <w:t>), note down how they found this information.</w:t>
+      </w:r>
+    </w:p>
+    <w:p>
+      <w:pPr>
+        <w:pStyle w:val="Liststycke"/>
+        <w:rPr>
+          <w:rFonts w:ascii="Lato" w:hAnsi="Lato" w:cs="Lato"/>
+          <w:b/>
+          <w:bCs/>
+          <w:sz w:val="24"/>
+          <w:szCs w:val="24"/>
+        </w:rPr>
+      </w:pPr>
+    </w:p>
+    <w:p>
+      <w:pPr>
+        <w:pStyle w:val="Liststycke"/>
+        <w:numPr>
+          <w:ilvl w:val="0"/>
+          <w:numId w:val="2"/>
+        </w:numPr>
+        <w:rPr>
+          <w:rFonts w:ascii="Lato" w:hAnsi="Lato" w:cs="Lato"/>
+          <w:b/>
+          <w:bCs/>
+          <w:sz w:val="24"/>
+          <w:szCs w:val="24"/>
+        </w:rPr>
+      </w:pPr>
+      <w:r>
+        <w:rPr>
+          <w:rFonts w:ascii="Lato" w:hAnsi="Lato" w:cs="Lato"/>
+          <w:b/>
+          <w:bCs/>
+          <w:sz w:val="24"/>
+          <w:szCs w:val="24"/>
+        </w:rPr>
+        <w:t xml:space="preserve">Filtering by sliders: </w:t>
+      </w:r>
+      <w:r>
+        <w:rPr>
+          <w:rFonts w:ascii="Lato" w:hAnsi="Lato" w:cs="Lato"/>
+          <w:sz w:val="24"/>
+          <w:szCs w:val="24"/>
+        </w:rPr>
+        <w:t>Instruct the test participants to reset all filters, i.e., the drop down menu headers show “</w:t>
+      </w:r>
+      <w:r>
+        <w:rPr>
+          <w:rFonts w:ascii="Lato" w:hAnsi="Lato" w:cs="Lato"/>
+          <w:b/>
+          <w:bCs/>
+          <w:sz w:val="24"/>
+          <w:szCs w:val="24"/>
+        </w:rPr>
+        <w:t>All Regions</w:t>
+      </w:r>
+      <w:r>
+        <w:rPr>
+          <w:rFonts w:ascii="Lato" w:hAnsi="Lato" w:cs="Lato"/>
+          <w:sz w:val="24"/>
+          <w:szCs w:val="24"/>
+        </w:rPr>
+        <w:t>” and “</w:t>
+      </w:r>
+      <w:r>
+        <w:rPr>
+          <w:rFonts w:ascii="Lato" w:hAnsi="Lato" w:cs="Lato"/>
+          <w:b/>
+          <w:bCs/>
+          <w:sz w:val="24"/>
+          <w:szCs w:val="24"/>
+        </w:rPr>
+        <w:t>All Power Sources</w:t>
+      </w:r>
+      <w:r>
+        <w:rPr>
+          <w:rFonts w:ascii="Lato" w:hAnsi="Lato" w:cs="Lato"/>
+          <w:sz w:val="24"/>
+          <w:szCs w:val="24"/>
+        </w:rPr>
+        <w:t xml:space="preserve">” and finally to reset the map to full screen. </w:t>
+      </w:r>
+      <w:r>
+        <w:rPr>
+          <w:rFonts w:ascii="Lato" w:hAnsi="Lato" w:cs="Lato"/>
+          <w:sz w:val="24"/>
+          <w:szCs w:val="24"/>
+        </w:rPr>
+        <w:t xml:space="preserve">The test participants are should now be tasked with finding the oldest power plant in the data (correct: </w:t>
+      </w:r>
+      <w:r>
+        <w:rPr>
+          <w:rFonts w:ascii="Lato" w:hAnsi="Lato" w:cs="Lato"/>
+          <w:b/>
+          <w:bCs/>
+          <w:sz w:val="24"/>
+          <w:szCs w:val="24"/>
+        </w:rPr>
+        <w:t>Granite</w:t>
+      </w:r>
+      <w:r>
+        <w:rPr>
+          <w:rFonts w:ascii="Lato" w:hAnsi="Lato" w:cs="Lato"/>
+          <w:b/>
+          <w:bCs/>
+          <w:sz w:val="24"/>
+          <w:szCs w:val="24"/>
+        </w:rPr>
+        <w:t xml:space="preserve"> in the US</w:t>
+      </w:r>
+      <w:r>
+        <w:rPr>
+          <w:rFonts w:ascii="Lato" w:hAnsi="Lato" w:cs="Lato"/>
+          <w:sz w:val="24"/>
+          <w:szCs w:val="24"/>
+        </w:rPr>
+        <w:t xml:space="preserve">, </w:t>
+      </w:r>
+      <w:r>
+        <w:rPr>
+          <w:rFonts w:ascii="Lato" w:hAnsi="Lato" w:cs="Lato"/>
+          <w:b/>
+          <w:bCs/>
+          <w:sz w:val="24"/>
+          <w:szCs w:val="24"/>
+        </w:rPr>
+        <w:t>1896</w:t>
+      </w:r>
+      <w:r>
+        <w:rPr>
+          <w:rFonts w:ascii="Lato" w:hAnsi="Lato" w:cs="Lato"/>
+          <w:sz w:val="24"/>
+          <w:szCs w:val="24"/>
+        </w:rPr>
+        <w:t xml:space="preserve">), and how many power plants were commissioned between 1896—1910 </w:t>
+      </w:r>
+      <w:r>
+        <w:rPr>
+          <w:rFonts w:ascii="Lato" w:hAnsi="Lato" w:cs="Lato"/>
+          <w:sz w:val="24"/>
+          <w:szCs w:val="24"/>
+        </w:rPr>
+        <w:lastRenderedPageBreak/>
+        <w:t xml:space="preserve">(correct: </w:t>
+      </w:r>
+      <w:r>
+        <w:rPr>
+          <w:rFonts w:ascii="Lato" w:hAnsi="Lato" w:cs="Lato"/>
+          <w:b/>
+          <w:bCs/>
+          <w:sz w:val="24"/>
+          <w:szCs w:val="24"/>
+        </w:rPr>
+        <w:t>81</w:t>
+      </w:r>
+      <w:r>
+        <w:rPr>
+          <w:rFonts w:ascii="Lato" w:hAnsi="Lato" w:cs="Lato"/>
+          <w:sz w:val="24"/>
+          <w:szCs w:val="24"/>
+        </w:rPr>
+        <w:t xml:space="preserve">). Instruct them to reset the commissioning year filter and instead find the number of power plants that has </w:t>
+      </w:r>
+      <w:r>
+        <w:rPr>
+          <w:rFonts w:ascii="Lato" w:hAnsi="Lato" w:cs="Lato"/>
+          <w:sz w:val="24"/>
+          <w:szCs w:val="24"/>
+        </w:rPr>
+        <w:t>an</w:t>
+      </w:r>
+      <w:r>
+        <w:rPr>
+          <w:rFonts w:ascii="Lato" w:hAnsi="Lato" w:cs="Lato"/>
+          <w:sz w:val="24"/>
+          <w:szCs w:val="24"/>
+        </w:rPr>
+        <w:t xml:space="preserve"> annual generation above 30k GWh (correct: </w:t>
+      </w:r>
+      <w:r>
+        <w:rPr>
+          <w:rFonts w:ascii="Lato" w:hAnsi="Lato" w:cs="Lato"/>
+          <w:b/>
+          <w:bCs/>
+          <w:sz w:val="24"/>
+          <w:szCs w:val="24"/>
+        </w:rPr>
+        <w:t xml:space="preserve">~26 </w:t>
+      </w:r>
+      <w:r>
+        <w:rPr>
+          <w:rFonts w:ascii="Lato" w:hAnsi="Lato" w:cs="Lato"/>
+          <w:sz w:val="24"/>
+          <w:szCs w:val="24"/>
+        </w:rPr>
+        <w:t>since the range</w:t>
+      </w:r>
+      <w:r>
+        <w:rPr>
+          <w:rFonts w:ascii="Lato" w:hAnsi="Lato" w:cs="Lato"/>
+          <w:sz w:val="24"/>
+          <w:szCs w:val="24"/>
+        </w:rPr>
+        <w:t xml:space="preserve"> slider</w:t>
+      </w:r>
+      <w:r>
+        <w:rPr>
+          <w:rFonts w:ascii="Lato" w:hAnsi="Lato" w:cs="Lato"/>
+          <w:sz w:val="24"/>
+          <w:szCs w:val="24"/>
+        </w:rPr>
+        <w:t xml:space="preserve"> is hard to get exactly on 30k</w:t>
+      </w:r>
+      <w:r>
+        <w:rPr>
+          <w:rFonts w:ascii="Lato" w:hAnsi="Lato" w:cs="Lato"/>
+          <w:sz w:val="24"/>
+          <w:szCs w:val="24"/>
+        </w:rPr>
+        <w:t xml:space="preserve">). Additionally, ask them which singular power plant produces the highest amount of electricity in the world (correct: </w:t>
+      </w:r>
+      <w:r>
+        <w:rPr>
+          <w:rFonts w:ascii="Lato" w:hAnsi="Lato" w:cs="Lato"/>
+          <w:b/>
+          <w:bCs/>
+          <w:sz w:val="24"/>
+          <w:szCs w:val="24"/>
+        </w:rPr>
+        <w:t>Kashiwazaki Kariwa</w:t>
+      </w:r>
+      <w:r>
+        <w:rPr>
+          <w:rFonts w:ascii="Lato" w:hAnsi="Lato" w:cs="Lato"/>
+          <w:b/>
+          <w:bCs/>
+          <w:sz w:val="24"/>
+          <w:szCs w:val="24"/>
+        </w:rPr>
+        <w:t xml:space="preserve"> in Japan</w:t>
+      </w:r>
+      <w:r>
+        <w:rPr>
+          <w:rFonts w:ascii="Lato" w:hAnsi="Lato" w:cs="Lato"/>
+          <w:sz w:val="24"/>
+          <w:szCs w:val="24"/>
+        </w:rPr>
+        <w:t xml:space="preserve">, </w:t>
+      </w:r>
+      <w:r>
+        <w:rPr>
+          <w:rFonts w:ascii="Lato" w:hAnsi="Lato" w:cs="Lato"/>
+          <w:b/>
+          <w:bCs/>
+          <w:sz w:val="24"/>
+          <w:szCs w:val="24"/>
+        </w:rPr>
+        <w:t>~66k</w:t>
+      </w:r>
+      <w:r>
+        <w:rPr>
+          <w:rFonts w:ascii="Lato" w:hAnsi="Lato" w:cs="Lato"/>
+          <w:sz w:val="24"/>
+          <w:szCs w:val="24"/>
+        </w:rPr>
+        <w:t>).</w:t>
+      </w:r>
+    </w:p>
+    <w:p>
+      <w:pPr>
+        <w:pStyle w:val="Liststycke"/>
+        <w:rPr>
+          <w:rFonts w:ascii="Lato" w:hAnsi="Lato" w:cs="Lato"/>
+          <w:b/>
+          <w:bCs/>
+          <w:sz w:val="24"/>
+          <w:szCs w:val="24"/>
+        </w:rPr>
+      </w:pPr>
+    </w:p>
+    <w:p>
+      <w:pPr>
+        <w:pStyle w:val="Liststycke"/>
+        <w:numPr>
+          <w:ilvl w:val="0"/>
+          <w:numId w:val="2"/>
+        </w:numPr>
+        <w:rPr>
+          <w:rFonts w:ascii="Lato" w:hAnsi="Lato" w:cs="Lato"/>
+          <w:sz w:val="24"/>
+          <w:szCs w:val="24"/>
+        </w:rPr>
+      </w:pPr>
+      <w:r>
+        <w:rPr>
+          <w:rFonts w:ascii="Lato" w:hAnsi="Lato" w:cs="Lato"/>
+          <w:b/>
+          <w:bCs/>
+          <w:sz w:val="24"/>
+          <w:szCs w:val="24"/>
+        </w:rPr>
+        <w:t>Additional comments</w:t>
+      </w:r>
+      <w:r>
+        <w:rPr>
+          <w:rFonts w:ascii="Lato" w:hAnsi="Lato" w:cs="Lato"/>
+          <w:b/>
+          <w:bCs/>
+          <w:sz w:val="24"/>
+          <w:szCs w:val="24"/>
+        </w:rPr>
+        <w:t xml:space="preserve">: </w:t>
+      </w:r>
+      <w:r>
+        <w:rPr>
+          <w:rFonts w:ascii="Lato" w:hAnsi="Lato" w:cs="Lato"/>
+          <w:sz w:val="24"/>
+          <w:szCs w:val="24"/>
+        </w:rPr>
+        <w:t>With the functionalities of the tool tested, ask the test participants if they have any additional comments on the tool and note them down if any. Lastly, thank them for their time.</w:t>
+      </w:r>
+    </w:p>
+    <w:p>
+      <w:pPr>
+        <w:pStyle w:val="Liststycke"/>
+        <w:rPr>
+          <w:rFonts w:ascii="Lato" w:hAnsi="Lato" w:cs="Lato"/>
+          <w:sz w:val="24"/>
+          <w:szCs w:val="24"/>
+        </w:rPr>
+      </w:pPr>
+    </w:p>
+    <w:p>
+      <w:pPr>
+        <w:pStyle w:val="Liststycke"/>
+        <w:numPr>
+          <w:ilvl w:val="0"/>
+          <w:numId w:val="2"/>
+        </w:numPr>
+        <w:rPr>
+          <w:rFonts w:ascii="Lato" w:hAnsi="Lato" w:cs="Lato"/>
+          <w:sz w:val="24"/>
+          <w:szCs w:val="24"/>
+        </w:rPr>
+      </w:pPr>
+      <w:r>
+        <w:rPr>
+          <w:rFonts w:ascii="Lato" w:hAnsi="Lato" w:cs="Lato"/>
+          <w:b/>
+          <w:bCs/>
+          <w:sz w:val="24"/>
+          <w:szCs w:val="24"/>
+        </w:rPr>
+        <w:t>(Possibly, ask the participants to complete a SUS-survey</w:t>
+      </w:r>
+      <w:r>
+        <w:rPr>
+          <w:rFonts w:ascii="Lato" w:hAnsi="Lato" w:cs="Lato"/>
+          <w:b/>
+          <w:bCs/>
+          <w:sz w:val="24"/>
+          <w:szCs w:val="24"/>
+        </w:rPr>
+        <w:t xml:space="preserve"> for quantitative data</w:t>
+      </w:r>
+      <w:r>
+        <w:rPr>
+          <w:rFonts w:ascii="Lato" w:hAnsi="Lato" w:cs="Lato"/>
+          <w:b/>
+          <w:bCs/>
+          <w:sz w:val="24"/>
+          <w:szCs w:val="24"/>
+        </w:rPr>
+        <w:t>)</w:t>
+      </w:r>
+    </w:p>
+    <w:p/>
     <w:p>
       <w:pPr>
         <w:rPr>
@@ -756,9 +2189,9 @@
 <file path=word/numbering.xml><?xml version="1.0" encoding="utf-8"?>
 <w:numbering xmlns:wpc="http://schemas.microsoft.com/office/word/2010/wordprocessingCanvas" xmlns:cx="http://schemas.microsoft.com/office/drawing/2014/chartex" xmlns:cx1="http://schemas.microsoft.com/office/drawing/2015/9/8/chartex" xmlns:cx2="http://schemas.microsoft.com/office/drawing/2015/10/21/chartex" xmlns:cx3="http://schemas.microsoft.com/office/drawing/2016/5/9/chartex" xmlns:cx4="http://schemas.microsoft.com/office/drawing/2016/5/10/chartex" xmlns:cx5="http://schemas.microsoft.com/office/drawing/2016/5/11/chartex" xmlns:cx6="http://schemas.microsoft.com/office/drawing/2016/5/12/chartex" xmlns:cx7="http://schemas.microsoft.com/office/drawing/2016/5/13/chartex" xmlns:cx8="http://schemas.microsoft.com/office/drawing/2016/5/14/chartex" xmlns:mc="http://schemas.openxmlformats.org/markup-compatibility/2006" xmlns:aink="http://schemas.microsoft.com/office/drawing/2016/ink" xmlns:am3d="http://schemas.microsoft.com/office/drawing/2017/model3d" xmlns:o="urn:schemas-microsoft-com:office:office" xmlns:oel="http://schemas.microsoft.com/office/2019/extlst" xmlns:r="http://schemas.openxmlformats.org/officeDocument/2006/relationships" xmlns:m="http://schemas.openxmlformats.org/officeDocument/2006/math" xmlns:v="urn:schemas-microsoft-com:vml" xmlns:wp14="http://schemas.microsoft.com/office/word/2010/wordprocessingDrawing" xmlns:wp="http://schemas.openxmlformats.org/drawingml/2006/wordprocessingDrawing" xmlns:w10="urn:schemas-microsoft-com:office:word" xmlns:w="http://schemas.openxmlformats.org/wordprocessingml/2006/main" xmlns:w14="http://schemas.microsoft.com/office/word/2010/wordml" xmlns:w15="http://schemas.microsoft.com/office/word/2012/wordml" xmlns:w16cei="http://schemas.microsoft.com/office/word/2026/wordml/cei" xmlns:w16cex="http://schemas.microsoft.com/office/word/2018/wordml/cex" xmlns:w16cid="http://schemas.microsoft.com/office/word/2016/wordml/cid" xmlns:w16="http://schemas.microsoft.com/office/word/2018/wordml" xmlns:w16du="http://schemas.microsoft.com/office/word/2023/wordml/word16du" xmlns:w16sdtdh="http://schemas.microsoft.com/office/word/2020/wordml/sdtdatahash" xmlns:w16sdtfl="http://schemas.microsoft.com/office/word/2024/wordml/sdtformatlock" xmlns:w16se="http://schemas.microsoft.com/office/word/2015/wordml/symex" xmlns:wpg="http://schemas.microsoft.com/office/word/2010/wordprocessingGroup" xmlns:wpi="http://schemas.microsoft.com/office/word/2010/wordprocessingInk" xmlns:wne="http://schemas.microsoft.com/office/word/2006/wordml" xmlns:wps="http://schemas.microsoft.com/office/word/2010/wordprocessingShape" mc:Ignorable="w14 w15 w16se w16cid w16 w16cex w16sdtdh w16sdtfl w16du wp14">
   <w:abstractNum w:abstractNumId="0" w15:restartNumberingAfterBreak="0">
-    <w:nsid w:val="670F6926"/>
+    <w:nsid w:val="3C595817"/>
     <w:multiLevelType w:val="hybridMultilevel"/>
-    <w:tmpl w:val="97DA355A"/>
+    <w:tmpl w:val="0770CC6C"/>
     <w:lvl w:ilvl="0" w:tplc="041D000F">
       <w:start w:val="1"/>
       <w:numFmt w:val="decimal"/>
@@ -780,7 +2213,7 @@
         <w:ind w:left="1440" w:hanging="360"/>
       </w:pPr>
     </w:lvl>
-    <w:lvl w:ilvl="2" w:tplc="041D001B" w:tentative="1">
+    <w:lvl w:ilvl="2" w:tplc="041D001B">
       <w:start w:val="1"/>
       <w:numFmt w:val="lowerRoman"/>
       <w:lvlText w:val="%3."/>
@@ -844,7 +2277,99 @@
       </w:pPr>
     </w:lvl>
   </w:abstractNum>
+  <w:abstractNum w:abstractNumId="1" w15:restartNumberingAfterBreak="0">
+    <w:nsid w:val="670F6926"/>
+    <w:multiLevelType w:val="hybridMultilevel"/>
+    <w:tmpl w:val="97DA355A"/>
+    <w:lvl w:ilvl="0" w:tplc="041D000F">
+      <w:start w:val="1"/>
+      <w:numFmt w:val="decimal"/>
+      <w:lvlText w:val="%1."/>
+      <w:lvlJc w:val="left"/>
+      <w:pPr>
+        <w:ind w:left="720" w:hanging="360"/>
+      </w:pPr>
+      <w:rPr>
+        <w:rFonts w:hint="default"/>
+      </w:rPr>
+    </w:lvl>
+    <w:lvl w:ilvl="1" w:tplc="041D0019">
+      <w:start w:val="1"/>
+      <w:numFmt w:val="lowerLetter"/>
+      <w:lvlText w:val="%2."/>
+      <w:lvlJc w:val="left"/>
+      <w:pPr>
+        <w:ind w:left="1440" w:hanging="360"/>
+      </w:pPr>
+    </w:lvl>
+    <w:lvl w:ilvl="2" w:tplc="041D001B" w:tentative="1">
+      <w:start w:val="1"/>
+      <w:numFmt w:val="lowerRoman"/>
+      <w:lvlText w:val="%3."/>
+      <w:lvlJc w:val="right"/>
+      <w:pPr>
+        <w:ind w:left="2160" w:hanging="180"/>
+      </w:pPr>
+    </w:lvl>
+    <w:lvl w:ilvl="3" w:tplc="041D000F" w:tentative="1">
+      <w:start w:val="1"/>
+      <w:numFmt w:val="decimal"/>
+      <w:lvlText w:val="%4."/>
+      <w:lvlJc w:val="left"/>
+      <w:pPr>
+        <w:ind w:left="2880" w:hanging="360"/>
+      </w:pPr>
+    </w:lvl>
+    <w:lvl w:ilvl="4" w:tplc="041D0019" w:tentative="1">
+      <w:start w:val="1"/>
+      <w:numFmt w:val="lowerLetter"/>
+      <w:lvlText w:val="%5."/>
+      <w:lvlJc w:val="left"/>
+      <w:pPr>
+        <w:ind w:left="3600" w:hanging="360"/>
+      </w:pPr>
+    </w:lvl>
+    <w:lvl w:ilvl="5" w:tplc="041D001B" w:tentative="1">
+      <w:start w:val="1"/>
+      <w:numFmt w:val="lowerRoman"/>
+      <w:lvlText w:val="%6."/>
+      <w:lvlJc w:val="right"/>
+      <w:pPr>
+        <w:ind w:left="4320" w:hanging="180"/>
+      </w:pPr>
+    </w:lvl>
+    <w:lvl w:ilvl="6" w:tplc="041D000F" w:tentative="1">
+      <w:start w:val="1"/>
+      <w:numFmt w:val="decimal"/>
+      <w:lvlText w:val="%7."/>
+      <w:lvlJc w:val="left"/>
+      <w:pPr>
+        <w:ind w:left="5040" w:hanging="360"/>
+      </w:pPr>
+    </w:lvl>
+    <w:lvl w:ilvl="7" w:tplc="041D0019" w:tentative="1">
+      <w:start w:val="1"/>
+      <w:numFmt w:val="lowerLetter"/>
+      <w:lvlText w:val="%8."/>
+      <w:lvlJc w:val="left"/>
+      <w:pPr>
+        <w:ind w:left="5760" w:hanging="360"/>
+      </w:pPr>
+    </w:lvl>
+    <w:lvl w:ilvl="8" w:tplc="041D001B" w:tentative="1">
+      <w:start w:val="1"/>
+      <w:numFmt w:val="lowerRoman"/>
+      <w:lvlText w:val="%9."/>
+      <w:lvlJc w:val="right"/>
+      <w:pPr>
+        <w:ind w:left="6480" w:hanging="180"/>
+      </w:pPr>
+    </w:lvl>
+  </w:abstractNum>
   <w:num w:numId="1" w16cid:durableId="215707196">
+    <w:abstractNumId w:val="1"/>
+  </w:num>
+  <w:num w:numId="2" w16cid:durableId="925774053">
     <w:abstractNumId w:val="0"/>
   </w:num>
 </w:numbering>
@@ -1457,7 +2982,6 @@
   <w:style w:type="character" w:default="1" w:styleId="Standardstycketeckensnitt">
     <w:name w:val="Default Paragraph Font"/>
     <w:uiPriority w:val="1"/>
-    <w:semiHidden/>
     <w:unhideWhenUsed/>
   </w:style>
   <w:style w:type="table" w:default="1" w:styleId="Normaltabell">

</xml_diff>